<commit_message>
Se actualizan los resultados 3.
</commit_message>
<xml_diff>
--- a/borrador_articulo_trad.docx
+++ b/borrador_articulo_trad.docx
@@ -3338,34 +3338,11 @@
       <w:pPr>
         <w:pStyle w:val="Normal"/>
         <w:bidi w:val="0"/>
-        <w:spacing w:before="0" w:after="0"/>
-        <w:jc w:val="both"/>
-        <w:rPr>
-          <w:b w:val="false"/>
-          <w:b w:val="false"/>
-          <w:bCs w:val="false"/>
-          <w:i w:val="false"/>
-          <w:i w:val="false"/>
-          <w:caps w:val="false"/>
-          <w:smallCaps w:val="false"/>
-          <w:color w:val="000000"/>
-          <w:spacing w:val="0"/>
-          <w:sz w:val="20"/>
-          <w:szCs w:val="20"/>
-        </w:rPr>
-      </w:pPr>
-      <w:r>
-        <w:rPr>
-          <w:b w:val="false"/>
-          <w:bCs w:val="false"/>
-          <w:i w:val="false"/>
-          <w:caps w:val="false"/>
-          <w:smallCaps w:val="false"/>
-          <w:color w:val="000000"/>
-          <w:spacing w:val="0"/>
-          <w:sz w:val="20"/>
-          <w:szCs w:val="20"/>
-        </w:rPr>
+        <w:jc w:val="both"/>
+        <w:rPr/>
+      </w:pPr>
+      <w:r>
+        <w:rPr/>
         <w:drawing>
           <wp:anchor behindDoc="0" distT="0" distB="0" distL="0" distR="0" simplePos="0" locked="0" layoutInCell="0" allowOverlap="1" relativeHeight="20">
             <wp:simplePos x="0" y="0"/>
@@ -3378,7 +3355,7 @@
             <wp:extent cx="6332220" cy="3161665"/>
             <wp:effectExtent l="0" t="0" r="0" b="0"/>
             <wp:wrapSquare wrapText="largest"/>
-            <wp:docPr id="2" name="Imagen2" descr=""/>
+            <wp:docPr id="2" name="Imagen6" descr=""/>
             <wp:cNvGraphicFramePr>
               <a:graphicFrameLocks xmlns:a="http://schemas.openxmlformats.org/drawingml/2006/main" noChangeAspect="1"/>
             </wp:cNvGraphicFramePr>
@@ -3386,7 +3363,7 @@
               <a:graphicData uri="http://schemas.openxmlformats.org/drawingml/2006/picture">
                 <pic:pic xmlns:pic="http://schemas.openxmlformats.org/drawingml/2006/picture">
                   <pic:nvPicPr>
-                    <pic:cNvPr id="2" name="Imagen2" descr=""/>
+                    <pic:cNvPr id="2" name="Imagen6" descr=""/>
                     <pic:cNvPicPr>
                       <a:picLocks noChangeAspect="1" noChangeArrowheads="1"/>
                     </pic:cNvPicPr>
@@ -3879,7 +3856,41 @@
                 <w:szCs w:val="24"/>
                 <w:u w:val="none"/>
               </w:rPr>
-              <w:t>0.11016</w:t>
+              <w:t>5</w:t>
+            </w:r>
+            <w:r>
+              <w:rPr>
+                <w:b w:val="false"/>
+                <w:bCs w:val="false"/>
+                <w:i w:val="false"/>
+                <w:iCs w:val="false"/>
+                <w:strike w:val="false"/>
+                <w:dstrike w:val="false"/>
+                <w:outline w:val="false"/>
+                <w:shadow w:val="false"/>
+                <w:color w:val="000000"/>
+                <w:sz w:val="24"/>
+                <w:szCs w:val="24"/>
+                <w:u w:val="none"/>
+              </w:rPr>
+              <w:t>.</w:t>
+            </w:r>
+            <w:r>
+              <w:rPr>
+                <w:b w:val="false"/>
+                <w:bCs w:val="false"/>
+                <w:i w:val="false"/>
+                <w:iCs w:val="false"/>
+                <w:strike w:val="false"/>
+                <w:dstrike w:val="false"/>
+                <w:outline w:val="false"/>
+                <w:shadow w:val="false"/>
+                <w:color w:val="000000"/>
+                <w:sz w:val="24"/>
+                <w:szCs w:val="24"/>
+                <w:u w:val="none"/>
+              </w:rPr>
+              <w:t>39</w:t>
             </w:r>
           </w:p>
         </w:tc>
@@ -3926,7 +3937,24 @@
                 <w:szCs w:val="24"/>
                 <w:u w:val="none"/>
               </w:rPr>
-              <w:t>1.10880</w:t>
+              <w:t>1.</w:t>
+            </w:r>
+            <w:r>
+              <w:rPr>
+                <w:b w:val="false"/>
+                <w:bCs w:val="false"/>
+                <w:i w:val="false"/>
+                <w:iCs w:val="false"/>
+                <w:strike w:val="false"/>
+                <w:dstrike w:val="false"/>
+                <w:outline w:val="false"/>
+                <w:shadow w:val="false"/>
+                <w:color w:val="000000"/>
+                <w:sz w:val="24"/>
+                <w:szCs w:val="24"/>
+                <w:u w:val="none"/>
+              </w:rPr>
+              <w:t>06</w:t>
             </w:r>
           </w:p>
         </w:tc>
@@ -4023,7 +4051,58 @@
                 <w:szCs w:val="24"/>
                 <w:u w:val="none"/>
               </w:rPr>
-              <w:t>0.10359</w:t>
+              <w:t>4</w:t>
+            </w:r>
+            <w:r>
+              <w:rPr>
+                <w:b w:val="false"/>
+                <w:bCs w:val="false"/>
+                <w:i w:val="false"/>
+                <w:iCs w:val="false"/>
+                <w:strike w:val="false"/>
+                <w:dstrike w:val="false"/>
+                <w:outline w:val="false"/>
+                <w:shadow w:val="false"/>
+                <w:color w:val="000000"/>
+                <w:sz w:val="24"/>
+                <w:szCs w:val="24"/>
+                <w:u w:val="none"/>
+              </w:rPr>
+              <w:t>.</w:t>
+            </w:r>
+            <w:r>
+              <w:rPr>
+                <w:b w:val="false"/>
+                <w:bCs w:val="false"/>
+                <w:i w:val="false"/>
+                <w:iCs w:val="false"/>
+                <w:strike w:val="false"/>
+                <w:dstrike w:val="false"/>
+                <w:outline w:val="false"/>
+                <w:shadow w:val="false"/>
+                <w:color w:val="000000"/>
+                <w:sz w:val="24"/>
+                <w:szCs w:val="24"/>
+                <w:u w:val="none"/>
+              </w:rPr>
+              <w:t>8</w:t>
+            </w:r>
+            <w:r>
+              <w:rPr>
+                <w:b w:val="false"/>
+                <w:bCs w:val="false"/>
+                <w:i w:val="false"/>
+                <w:iCs w:val="false"/>
+                <w:strike w:val="false"/>
+                <w:dstrike w:val="false"/>
+                <w:outline w:val="false"/>
+                <w:shadow w:val="false"/>
+                <w:color w:val="000000"/>
+                <w:sz w:val="24"/>
+                <w:szCs w:val="24"/>
+                <w:u w:val="none"/>
+              </w:rPr>
+              <w:t>9</w:t>
             </w:r>
           </w:p>
         </w:tc>
@@ -4070,7 +4149,24 @@
                 <w:szCs w:val="24"/>
                 <w:u w:val="none"/>
               </w:rPr>
-              <w:t>1.04775</w:t>
+              <w:t>1.0</w:t>
+            </w:r>
+            <w:r>
+              <w:rPr>
+                <w:b w:val="false"/>
+                <w:bCs w:val="false"/>
+                <w:i w:val="false"/>
+                <w:iCs w:val="false"/>
+                <w:strike w:val="false"/>
+                <w:dstrike w:val="false"/>
+                <w:outline w:val="false"/>
+                <w:shadow w:val="false"/>
+                <w:color w:val="000000"/>
+                <w:sz w:val="24"/>
+                <w:szCs w:val="24"/>
+                <w:u w:val="none"/>
+              </w:rPr>
+              <w:t>3</w:t>
             </w:r>
           </w:p>
         </w:tc>
@@ -4167,7 +4263,41 @@
                 <w:szCs w:val="24"/>
                 <w:u w:val="none"/>
               </w:rPr>
-              <w:t>0.10513</w:t>
+              <w:t>5</w:t>
+            </w:r>
+            <w:r>
+              <w:rPr>
+                <w:b w:val="false"/>
+                <w:bCs w:val="false"/>
+                <w:i w:val="false"/>
+                <w:iCs w:val="false"/>
+                <w:strike w:val="false"/>
+                <w:dstrike w:val="false"/>
+                <w:outline w:val="false"/>
+                <w:shadow w:val="false"/>
+                <w:color w:val="000000"/>
+                <w:sz w:val="24"/>
+                <w:szCs w:val="24"/>
+                <w:u w:val="none"/>
+              </w:rPr>
+              <w:t>.</w:t>
+            </w:r>
+            <w:r>
+              <w:rPr>
+                <w:b w:val="false"/>
+                <w:bCs w:val="false"/>
+                <w:i w:val="false"/>
+                <w:iCs w:val="false"/>
+                <w:strike w:val="false"/>
+                <w:dstrike w:val="false"/>
+                <w:outline w:val="false"/>
+                <w:shadow w:val="false"/>
+                <w:color w:val="000000"/>
+                <w:sz w:val="24"/>
+                <w:szCs w:val="24"/>
+                <w:u w:val="none"/>
+              </w:rPr>
+              <w:t>08</w:t>
             </w:r>
           </w:p>
         </w:tc>
@@ -4214,7 +4344,7 @@
                 <w:szCs w:val="24"/>
                 <w:u w:val="none"/>
               </w:rPr>
-              <w:t>1.09873</w:t>
+              <w:t>1.09</w:t>
             </w:r>
           </w:p>
         </w:tc>
@@ -4311,7 +4441,58 @@
                 <w:szCs w:val="24"/>
                 <w:u w:val="none"/>
               </w:rPr>
-              <w:t>0.09566</w:t>
+              <w:t>4</w:t>
+            </w:r>
+            <w:r>
+              <w:rPr>
+                <w:b w:val="false"/>
+                <w:bCs w:val="false"/>
+                <w:i w:val="false"/>
+                <w:iCs w:val="false"/>
+                <w:strike w:val="false"/>
+                <w:dstrike w:val="false"/>
+                <w:outline w:val="false"/>
+                <w:shadow w:val="false"/>
+                <w:color w:val="000000"/>
+                <w:sz w:val="24"/>
+                <w:szCs w:val="24"/>
+                <w:u w:val="none"/>
+              </w:rPr>
+              <w:t>.</w:t>
+            </w:r>
+            <w:r>
+              <w:rPr>
+                <w:b w:val="false"/>
+                <w:bCs w:val="false"/>
+                <w:i w:val="false"/>
+                <w:iCs w:val="false"/>
+                <w:strike w:val="false"/>
+                <w:dstrike w:val="false"/>
+                <w:outline w:val="false"/>
+                <w:shadow w:val="false"/>
+                <w:color w:val="000000"/>
+                <w:sz w:val="24"/>
+                <w:szCs w:val="24"/>
+                <w:u w:val="none"/>
+              </w:rPr>
+              <w:t>4</w:t>
+            </w:r>
+            <w:r>
+              <w:rPr>
+                <w:b w:val="false"/>
+                <w:bCs w:val="false"/>
+                <w:i w:val="false"/>
+                <w:iCs w:val="false"/>
+                <w:strike w:val="false"/>
+                <w:dstrike w:val="false"/>
+                <w:outline w:val="false"/>
+                <w:shadow w:val="false"/>
+                <w:color w:val="000000"/>
+                <w:sz w:val="24"/>
+                <w:szCs w:val="24"/>
+                <w:u w:val="none"/>
+              </w:rPr>
+              <w:t>6</w:t>
             </w:r>
           </w:p>
         </w:tc>
@@ -4358,7 +4539,41 @@
                 <w:szCs w:val="24"/>
                 <w:u w:val="none"/>
               </w:rPr>
-              <w:t>1.02279</w:t>
+              <w:t>1</w:t>
+            </w:r>
+            <w:r>
+              <w:rPr>
+                <w:b w:val="false"/>
+                <w:bCs w:val="false"/>
+                <w:i w:val="false"/>
+                <w:iCs w:val="false"/>
+                <w:strike w:val="false"/>
+                <w:dstrike w:val="false"/>
+                <w:outline w:val="false"/>
+                <w:shadow w:val="false"/>
+                <w:color w:val="000000"/>
+                <w:sz w:val="24"/>
+                <w:szCs w:val="24"/>
+                <w:u w:val="none"/>
+              </w:rPr>
+              <w:t>.</w:t>
+            </w:r>
+            <w:r>
+              <w:rPr>
+                <w:b w:val="false"/>
+                <w:bCs w:val="false"/>
+                <w:i w:val="false"/>
+                <w:iCs w:val="false"/>
+                <w:strike w:val="false"/>
+                <w:dstrike w:val="false"/>
+                <w:outline w:val="false"/>
+                <w:shadow w:val="false"/>
+                <w:color w:val="000000"/>
+                <w:sz w:val="24"/>
+                <w:szCs w:val="24"/>
+                <w:u w:val="none"/>
+              </w:rPr>
+              <w:t>0</w:t>
             </w:r>
           </w:p>
         </w:tc>
@@ -4455,7 +4670,41 @@
                 <w:szCs w:val="24"/>
                 <w:u w:val="none"/>
               </w:rPr>
-              <w:t>0.10318</w:t>
+              <w:t>4</w:t>
+            </w:r>
+            <w:r>
+              <w:rPr>
+                <w:b w:val="false"/>
+                <w:bCs w:val="false"/>
+                <w:i w:val="false"/>
+                <w:iCs w:val="false"/>
+                <w:strike w:val="false"/>
+                <w:dstrike w:val="false"/>
+                <w:outline w:val="false"/>
+                <w:shadow w:val="false"/>
+                <w:color w:val="000000"/>
+                <w:sz w:val="24"/>
+                <w:szCs w:val="24"/>
+                <w:u w:val="none"/>
+              </w:rPr>
+              <w:t>.</w:t>
+            </w:r>
+            <w:r>
+              <w:rPr>
+                <w:b w:val="false"/>
+                <w:bCs w:val="false"/>
+                <w:i w:val="false"/>
+                <w:iCs w:val="false"/>
+                <w:strike w:val="false"/>
+                <w:dstrike w:val="false"/>
+                <w:outline w:val="false"/>
+                <w:shadow w:val="false"/>
+                <w:color w:val="000000"/>
+                <w:sz w:val="24"/>
+                <w:szCs w:val="24"/>
+                <w:u w:val="none"/>
+              </w:rPr>
+              <w:t>96</w:t>
             </w:r>
           </w:p>
         </w:tc>
@@ -4502,7 +4751,41 @@
                 <w:szCs w:val="24"/>
                 <w:u w:val="none"/>
               </w:rPr>
-              <w:t>1.09684</w:t>
+              <w:t>1</w:t>
+            </w:r>
+            <w:r>
+              <w:rPr>
+                <w:b w:val="false"/>
+                <w:bCs w:val="false"/>
+                <w:i w:val="false"/>
+                <w:iCs w:val="false"/>
+                <w:strike w:val="false"/>
+                <w:dstrike w:val="false"/>
+                <w:outline w:val="false"/>
+                <w:shadow w:val="false"/>
+                <w:color w:val="000000"/>
+                <w:sz w:val="24"/>
+                <w:szCs w:val="24"/>
+                <w:u w:val="none"/>
+              </w:rPr>
+              <w:t>.0</w:t>
+            </w:r>
+            <w:r>
+              <w:rPr>
+                <w:b w:val="false"/>
+                <w:bCs w:val="false"/>
+                <w:i w:val="false"/>
+                <w:iCs w:val="false"/>
+                <w:strike w:val="false"/>
+                <w:dstrike w:val="false"/>
+                <w:outline w:val="false"/>
+                <w:shadow w:val="false"/>
+                <w:color w:val="000000"/>
+                <w:sz w:val="24"/>
+                <w:szCs w:val="24"/>
+                <w:u w:val="none"/>
+              </w:rPr>
+              <w:t>8</w:t>
             </w:r>
           </w:p>
         </w:tc>
@@ -4599,7 +4882,41 @@
                 <w:szCs w:val="24"/>
                 <w:u w:val="none"/>
               </w:rPr>
-              <w:t>0.10350</w:t>
+              <w:t>4</w:t>
+            </w:r>
+            <w:r>
+              <w:rPr>
+                <w:b w:val="false"/>
+                <w:bCs w:val="false"/>
+                <w:i w:val="false"/>
+                <w:iCs w:val="false"/>
+                <w:strike w:val="false"/>
+                <w:dstrike w:val="false"/>
+                <w:outline w:val="false"/>
+                <w:shadow w:val="false"/>
+                <w:color w:val="000000"/>
+                <w:sz w:val="24"/>
+                <w:szCs w:val="24"/>
+                <w:u w:val="none"/>
+              </w:rPr>
+              <w:t>.</w:t>
+            </w:r>
+            <w:r>
+              <w:rPr>
+                <w:b w:val="false"/>
+                <w:bCs w:val="false"/>
+                <w:i w:val="false"/>
+                <w:iCs w:val="false"/>
+                <w:strike w:val="false"/>
+                <w:dstrike w:val="false"/>
+                <w:outline w:val="false"/>
+                <w:shadow w:val="false"/>
+                <w:color w:val="000000"/>
+                <w:sz w:val="24"/>
+                <w:szCs w:val="24"/>
+                <w:u w:val="none"/>
+              </w:rPr>
+              <w:t>87</w:t>
             </w:r>
           </w:p>
         </w:tc>
@@ -4646,7 +4963,24 @@
                 <w:szCs w:val="24"/>
                 <w:u w:val="none"/>
               </w:rPr>
-              <w:t>1.06101</w:t>
+              <w:t>1.0</w:t>
+            </w:r>
+            <w:r>
+              <w:rPr>
+                <w:b w:val="false"/>
+                <w:bCs w:val="false"/>
+                <w:i w:val="false"/>
+                <w:iCs w:val="false"/>
+                <w:strike w:val="false"/>
+                <w:dstrike w:val="false"/>
+                <w:outline w:val="false"/>
+                <w:shadow w:val="false"/>
+                <w:color w:val="000000"/>
+                <w:sz w:val="24"/>
+                <w:szCs w:val="24"/>
+                <w:u w:val="none"/>
+              </w:rPr>
+              <w:t>4</w:t>
             </w:r>
           </w:p>
         </w:tc>
@@ -4743,7 +5077,41 @@
                 <w:szCs w:val="24"/>
                 <w:u w:val="none"/>
               </w:rPr>
-              <w:t>0.10520</w:t>
+              <w:t>5</w:t>
+            </w:r>
+            <w:r>
+              <w:rPr>
+                <w:b w:val="false"/>
+                <w:bCs w:val="false"/>
+                <w:i w:val="false"/>
+                <w:iCs w:val="false"/>
+                <w:strike w:val="false"/>
+                <w:dstrike w:val="false"/>
+                <w:outline w:val="false"/>
+                <w:shadow w:val="false"/>
+                <w:color w:val="000000"/>
+                <w:sz w:val="24"/>
+                <w:szCs w:val="24"/>
+                <w:u w:val="none"/>
+              </w:rPr>
+              <w:t>.</w:t>
+            </w:r>
+            <w:r>
+              <w:rPr>
+                <w:b w:val="false"/>
+                <w:bCs w:val="false"/>
+                <w:i w:val="false"/>
+                <w:iCs w:val="false"/>
+                <w:strike w:val="false"/>
+                <w:dstrike w:val="false"/>
+                <w:outline w:val="false"/>
+                <w:shadow w:val="false"/>
+                <w:color w:val="000000"/>
+                <w:sz w:val="24"/>
+                <w:szCs w:val="24"/>
+                <w:u w:val="none"/>
+              </w:rPr>
+              <w:t>07</w:t>
             </w:r>
           </w:p>
         </w:tc>
@@ -4790,7 +5158,24 @@
                 <w:szCs w:val="24"/>
                 <w:u w:val="none"/>
               </w:rPr>
-              <w:t>1.11394</w:t>
+              <w:t>1.1</w:t>
+            </w:r>
+            <w:r>
+              <w:rPr>
+                <w:b w:val="false"/>
+                <w:bCs w:val="false"/>
+                <w:i w:val="false"/>
+                <w:iCs w:val="false"/>
+                <w:strike w:val="false"/>
+                <w:dstrike w:val="false"/>
+                <w:outline w:val="false"/>
+                <w:shadow w:val="false"/>
+                <w:color w:val="000000"/>
+                <w:sz w:val="24"/>
+                <w:szCs w:val="24"/>
+                <w:u w:val="none"/>
+              </w:rPr>
+              <w:t>0</w:t>
             </w:r>
           </w:p>
         </w:tc>
@@ -4887,7 +5272,41 @@
                 <w:szCs w:val="24"/>
                 <w:u w:val="none"/>
               </w:rPr>
-              <w:t>0.08977</w:t>
+              <w:t>4</w:t>
+            </w:r>
+            <w:r>
+              <w:rPr>
+                <w:b w:val="false"/>
+                <w:bCs w:val="false"/>
+                <w:i w:val="false"/>
+                <w:iCs w:val="false"/>
+                <w:strike w:val="false"/>
+                <w:dstrike w:val="false"/>
+                <w:outline w:val="false"/>
+                <w:shadow w:val="false"/>
+                <w:color w:val="000000"/>
+                <w:sz w:val="24"/>
+                <w:szCs w:val="24"/>
+                <w:u w:val="none"/>
+              </w:rPr>
+              <w:t>.</w:t>
+            </w:r>
+            <w:r>
+              <w:rPr>
+                <w:b w:val="false"/>
+                <w:bCs w:val="false"/>
+                <w:i w:val="false"/>
+                <w:iCs w:val="false"/>
+                <w:strike w:val="false"/>
+                <w:dstrike w:val="false"/>
+                <w:outline w:val="false"/>
+                <w:shadow w:val="false"/>
+                <w:color w:val="000000"/>
+                <w:sz w:val="24"/>
+                <w:szCs w:val="24"/>
+                <w:u w:val="none"/>
+              </w:rPr>
+              <w:t>43</w:t>
             </w:r>
           </w:p>
         </w:tc>
@@ -4934,7 +5353,41 @@
                 <w:szCs w:val="24"/>
                 <w:u w:val="none"/>
               </w:rPr>
-              <w:t>1.00012</w:t>
+              <w:t>0</w:t>
+            </w:r>
+            <w:r>
+              <w:rPr>
+                <w:b w:val="false"/>
+                <w:bCs w:val="false"/>
+                <w:i w:val="false"/>
+                <w:iCs w:val="false"/>
+                <w:strike w:val="false"/>
+                <w:dstrike w:val="false"/>
+                <w:outline w:val="false"/>
+                <w:shadow w:val="false"/>
+                <w:color w:val="000000"/>
+                <w:sz w:val="24"/>
+                <w:szCs w:val="24"/>
+                <w:u w:val="none"/>
+              </w:rPr>
+              <w:t>.</w:t>
+            </w:r>
+            <w:r>
+              <w:rPr>
+                <w:b w:val="false"/>
+                <w:bCs w:val="false"/>
+                <w:i w:val="false"/>
+                <w:iCs w:val="false"/>
+                <w:strike w:val="false"/>
+                <w:dstrike w:val="false"/>
+                <w:outline w:val="false"/>
+                <w:shadow w:val="false"/>
+                <w:color w:val="000000"/>
+                <w:sz w:val="24"/>
+                <w:szCs w:val="24"/>
+                <w:u w:val="none"/>
+              </w:rPr>
+              <w:t>99</w:t>
             </w:r>
           </w:p>
         </w:tc>
@@ -5035,7 +5488,41 @@
                 <w:szCs w:val="24"/>
                 <w:u w:val="none"/>
               </w:rPr>
-              <w:t>0.09655</w:t>
+              <w:t>4</w:t>
+            </w:r>
+            <w:r>
+              <w:rPr>
+                <w:b w:val="false"/>
+                <w:bCs w:val="false"/>
+                <w:i w:val="false"/>
+                <w:iCs w:val="false"/>
+                <w:strike w:val="false"/>
+                <w:dstrike w:val="false"/>
+                <w:outline w:val="false"/>
+                <w:shadow w:val="false"/>
+                <w:color w:val="000000"/>
+                <w:sz w:val="24"/>
+                <w:szCs w:val="24"/>
+                <w:u w:val="none"/>
+              </w:rPr>
+              <w:t>.</w:t>
+            </w:r>
+            <w:r>
+              <w:rPr>
+                <w:b w:val="false"/>
+                <w:bCs w:val="false"/>
+                <w:i w:val="false"/>
+                <w:iCs w:val="false"/>
+                <w:strike w:val="false"/>
+                <w:dstrike w:val="false"/>
+                <w:outline w:val="false"/>
+                <w:shadow w:val="false"/>
+                <w:color w:val="000000"/>
+                <w:sz w:val="24"/>
+                <w:szCs w:val="24"/>
+                <w:u w:val="none"/>
+              </w:rPr>
+              <w:t>60</w:t>
             </w:r>
           </w:p>
         </w:tc>
@@ -5084,7 +5571,24 @@
                 <w:szCs w:val="24"/>
                 <w:u w:val="none"/>
               </w:rPr>
-              <w:t>1.03032</w:t>
+              <w:t>1.0</w:t>
+            </w:r>
+            <w:r>
+              <w:rPr>
+                <w:b w:val="false"/>
+                <w:bCs w:val="false"/>
+                <w:i w:val="false"/>
+                <w:iCs w:val="false"/>
+                <w:strike w:val="false"/>
+                <w:dstrike w:val="false"/>
+                <w:outline w:val="false"/>
+                <w:shadow w:val="false"/>
+                <w:color w:val="000000"/>
+                <w:sz w:val="24"/>
+                <w:szCs w:val="24"/>
+                <w:u w:val="none"/>
+              </w:rPr>
+              <w:t>2</w:t>
             </w:r>
           </w:p>
         </w:tc>
@@ -10996,5 +11500,18 @@
     </w:pPr>
     <w:rPr/>
   </w:style>
+  <w:style w:type="paragraph" w:styleId="Ttulodelatabla">
+    <w:name w:val="Título de la tabla"/>
+    <w:basedOn w:val="Contenidodelatabla"/>
+    <w:qFormat/>
+    <w:pPr>
+      <w:suppressLineNumbers/>
+      <w:jc w:val="center"/>
+    </w:pPr>
+    <w:rPr>
+      <w:b/>
+      <w:bCs/>
+    </w:rPr>
+  </w:style>
 </w:styles>
 </file>
</xml_diff>